<commit_message>
docs(sync): backfill W5-FIX-CRITICAL commit SHAs in As-Built and SECURITY
</commit_message>
<xml_diff>
--- a/docs/deliverable/AS-BUILT.docx
+++ b/docs/deliverable/AS-BUILT.docx
@@ -22632,7 +22632,7 @@
               <w:t xml:space="preserve">api/routes/safety_routes.py</w:t>
             </w:r>
             <w:r>
-              <w:t xml:space="preserve">; commit SHA TBD pada sync time, lihat backend git log untuk hash W5-FIX-CRITICAL final)</w:t>
+              <w:t xml:space="preserve">; commit b5a98e8 (backend) plus 40754cd (frontend))</w:t>
             </w:r>
           </w:p>
         </w:tc>
@@ -23225,7 +23225,7 @@
               <w:t xml:space="preserve"> </w:t>
             </w:r>
             <w:r>
-              <w:t xml:space="preserve">(commit SHA TBD pada sync time)</w:t>
+              <w:t xml:space="preserve">(commit b5a98e8 (backend) plus 40754cd (frontend))</w:t>
             </w:r>
           </w:p>
         </w:tc>
@@ -23594,7 +23594,7 @@
                 <w:b/>
                 <w:bCs/>
               </w:rPr>
-              <w:t xml:space="preserve">(commit SHA TBD pada sync time)</w:t>
+              <w:t xml:space="preserve">(commit b5a98e8 (backend) plus 40754cd (frontend))</w:t>
             </w:r>
           </w:p>
         </w:tc>
@@ -23776,7 +23776,7 @@
               <w:t xml:space="preserve"> </w:t>
             </w:r>
             <w:r>
-              <w:t xml:space="preserve">(commit SHA TBD pada sync time); Cloud Run gunicorn worker tetap single-threaded per request namun threadpool serialisasi via lock</w:t>
+              <w:t xml:space="preserve">(commit b5a98e8 (backend) plus 40754cd (frontend)); Cloud Run gunicorn worker tetap single-threaded per request namun threadpool serialisasi via lock</w:t>
             </w:r>
           </w:p>
         </w:tc>
@@ -24095,7 +24095,7 @@
               <w:t xml:space="preserve"> </w:t>
             </w:r>
             <w:r>
-              <w:t xml:space="preserve">(commit SHA TBD pada sync time)</w:t>
+              <w:t xml:space="preserve">(commit b5a98e8 (backend) plus 40754cd (frontend))</w:t>
             </w:r>
           </w:p>
         </w:tc>

</xml_diff>